<commit_message>
revisi BAST PCL agar tanggal jadi terbilang
</commit_message>
<xml_diff>
--- a/public/bast-pcl-ke-ppk.docx
+++ b/public/bast-pcl-ke-ppk.docx
@@ -1,6 +1,6 @@
 
 <file path=word/document.xml><?xml version="1.0" encoding="utf-8"?>
-<w:document xmlns:wpc="http://schemas.microsoft.com/office/word/2010/wordprocessingCanvas" xmlns:cx="http://schemas.microsoft.com/office/drawing/2014/chartex" xmlns:cx1="http://schemas.microsoft.com/office/drawing/2015/9/8/chartex" xmlns:cx2="http://schemas.microsoft.com/office/drawing/2015/10/21/chartex" xmlns:cx3="http://schemas.microsoft.com/office/drawing/2016/5/9/chartex" xmlns:cx4="http://schemas.microsoft.com/office/drawing/2016/5/10/chartex" xmlns:cx5="http://schemas.microsoft.com/office/drawing/2016/5/11/chartex" xmlns:cx6="http://schemas.microsoft.com/office/drawing/2016/5/12/chartex" xmlns:cx7="http://schemas.microsoft.com/office/drawing/2016/5/13/chartex" xmlns:cx8="http://schemas.microsoft.com/office/drawing/2016/5/14/chartex" xmlns:mc="http://schemas.openxmlformats.org/markup-compatibility/2006" xmlns:aink="http://schemas.microsoft.com/office/drawing/2016/ink" xmlns:am3d="http://schemas.microsoft.com/office/drawing/2017/model3d" xmlns:o="urn:schemas-microsoft-com:office:office" xmlns:oel="http://schemas.microsoft.com/office/2019/extlst" xmlns:r="http://schemas.openxmlformats.org/officeDocument/2006/relationships" xmlns:m="http://schemas.openxmlformats.org/officeDocument/2006/math" xmlns:v="urn:schemas-microsoft-com:vml" xmlns:wp14="http://schemas.microsoft.com/office/word/2010/wordprocessingDrawing" xmlns:wp="http://schemas.openxmlformats.org/drawingml/2006/wordprocessingDrawing" xmlns:w10="urn:schemas-microsoft-com:office:word" xmlns:w="http://schemas.openxmlformats.org/wordprocessingml/2006/main" xmlns:w14="http://schemas.microsoft.com/office/word/2010/wordml" xmlns:w15="http://schemas.microsoft.com/office/word/2012/wordml" xmlns:w16cex="http://schemas.microsoft.com/office/word/2018/wordml/cex" xmlns:w16cid="http://schemas.microsoft.com/office/word/2016/wordml/cid" xmlns:w16="http://schemas.microsoft.com/office/word/2018/wordml" xmlns:w16du="http://schemas.microsoft.com/office/word/2023/wordml/word16du" xmlns:w16sdtdh="http://schemas.microsoft.com/office/word/2020/wordml/sdtdatahash" xmlns:w16sdtfl="http://schemas.microsoft.com/office/word/2024/wordml/sdtformatlock" xmlns:w16se="http://schemas.microsoft.com/office/word/2015/wordml/symex" xmlns:wpg="http://schemas.microsoft.com/office/word/2010/wordprocessingGroup" xmlns:wpi="http://schemas.microsoft.com/office/word/2010/wordprocessingInk" xmlns:wne="http://schemas.microsoft.com/office/word/2006/wordml" xmlns:wps="http://schemas.microsoft.com/office/word/2010/wordprocessingShape" mc:Ignorable="w14 w15 w16se w16cid w16 w16cex w16sdtdh w16sdtfl w16du wp14">
+<w:document xmlns:wpc="http://schemas.microsoft.com/office/word/2010/wordprocessingCanvas" xmlns:cx="http://schemas.microsoft.com/office/drawing/2014/chartex" xmlns:cx1="http://schemas.microsoft.com/office/drawing/2015/9/8/chartex" xmlns:cx2="http://schemas.microsoft.com/office/drawing/2015/10/21/chartex" xmlns:cx3="http://schemas.microsoft.com/office/drawing/2016/5/9/chartex" xmlns:cx4="http://schemas.microsoft.com/office/drawing/2016/5/10/chartex" xmlns:cx5="http://schemas.microsoft.com/office/drawing/2016/5/11/chartex" xmlns:cx6="http://schemas.microsoft.com/office/drawing/2016/5/12/chartex" xmlns:cx7="http://schemas.microsoft.com/office/drawing/2016/5/13/chartex" xmlns:cx8="http://schemas.microsoft.com/office/drawing/2016/5/14/chartex" xmlns:mc="http://schemas.openxmlformats.org/markup-compatibility/2006" xmlns:aink="http://schemas.microsoft.com/office/drawing/2016/ink" xmlns:am3d="http://schemas.microsoft.com/office/drawing/2017/model3d" xmlns:o="urn:schemas-microsoft-com:office:office" xmlns:oel="http://schemas.microsoft.com/office/2019/extlst" xmlns:r="http://schemas.openxmlformats.org/officeDocument/2006/relationships" xmlns:m="http://schemas.openxmlformats.org/officeDocument/2006/math" xmlns:v="urn:schemas-microsoft-com:vml" xmlns:wp14="http://schemas.microsoft.com/office/word/2010/wordprocessingDrawing" xmlns:wp="http://schemas.openxmlformats.org/drawingml/2006/wordprocessingDrawing" xmlns:w10="urn:schemas-microsoft-com:office:word" xmlns:w="http://schemas.openxmlformats.org/wordprocessingml/2006/main" xmlns:w14="http://schemas.microsoft.com/office/word/2010/wordml" xmlns:w15="http://schemas.microsoft.com/office/word/2012/wordml" xmlns:w16cei="http://schemas.microsoft.com/office/word/2026/wordml/cei" xmlns:w16cex="http://schemas.microsoft.com/office/word/2018/wordml/cex" xmlns:w16cid="http://schemas.microsoft.com/office/word/2016/wordml/cid" xmlns:w16="http://schemas.microsoft.com/office/word/2018/wordml" xmlns:w16du="http://schemas.microsoft.com/office/word/2023/wordml/word16du" xmlns:w16sdtdh="http://schemas.microsoft.com/office/word/2020/wordml/sdtdatahash" xmlns:w16sdtfl="http://schemas.microsoft.com/office/word/2024/wordml/sdtformatlock" xmlns:w16se="http://schemas.microsoft.com/office/word/2015/wordml/symex" xmlns:wpg="http://schemas.microsoft.com/office/word/2010/wordprocessingGroup" xmlns:wpi="http://schemas.microsoft.com/office/word/2010/wordprocessingInk" xmlns:wne="http://schemas.microsoft.com/office/word/2006/wordml" xmlns:wps="http://schemas.microsoft.com/office/word/2010/wordprocessingShape" mc:Ignorable="w14 w15 w16se w16cid w16 w16cex w16sdtdh w16sdtfl w16du wp14">
   <w:body>
     <w:p>
       <w:pPr>
@@ -394,6 +394,48 @@
           <w:szCs w:val="24"/>
         </w:rPr>
         <w:t>}</w:t>
+      </w:r>
+      <w:r>
+        <w:rPr>
+          <w:rFonts w:ascii="Arial Narrow" w:eastAsia="Arial Narrow" w:hAnsi="Arial Narrow" w:cs="Arial Narrow"/>
+          <w:sz w:val="24"/>
+          <w:szCs w:val="24"/>
+        </w:rPr>
+        <w:t xml:space="preserve"> ($</w:t>
+      </w:r>
+      <w:r>
+        <w:rPr>
+          <w:rFonts w:ascii="Arial Narrow" w:eastAsia="Arial Narrow" w:hAnsi="Arial Narrow" w:cs="Arial Narrow"/>
+          <w:sz w:val="24"/>
+          <w:szCs w:val="24"/>
+        </w:rPr>
+        <w:t>{</w:t>
+      </w:r>
+      <w:proofErr w:type="spellStart"/>
+      <w:r>
+        <w:rPr>
+          <w:rFonts w:ascii="Arial Narrow" w:eastAsia="Arial Narrow" w:hAnsi="Arial Narrow" w:cs="Arial Narrow"/>
+          <w:sz w:val="24"/>
+          <w:szCs w:val="24"/>
+        </w:rPr>
+        <w:t>tanggal_lengkap</w:t>
+      </w:r>
+      <w:proofErr w:type="spellEnd"/>
+      <w:r>
+        <w:rPr>
+          <w:rFonts w:ascii="Arial Narrow" w:eastAsia="Arial Narrow" w:hAnsi="Arial Narrow" w:cs="Arial Narrow"/>
+          <w:sz w:val="24"/>
+          <w:szCs w:val="24"/>
+        </w:rPr>
+        <w:t>}</w:t>
+      </w:r>
+      <w:r>
+        <w:rPr>
+          <w:rFonts w:ascii="Arial Narrow" w:eastAsia="Arial Narrow" w:hAnsi="Arial Narrow" w:cs="Arial Narrow"/>
+          <w:sz w:val="24"/>
+          <w:szCs w:val="24"/>
+        </w:rPr>
+        <w:t>)</w:t>
       </w:r>
       <w:r>
         <w:rPr>
@@ -552,7 +594,25 @@
           <w:szCs w:val="24"/>
         </w:rPr>
         <w:tab/>
-        <w:t>:  Widya Khairani, SST</w:t>
+        <w:t xml:space="preserve">:  Widya </w:t>
+      </w:r>
+      <w:proofErr w:type="spellStart"/>
+      <w:r>
+        <w:rPr>
+          <w:rFonts w:ascii="Arial Narrow" w:eastAsia="Arial Narrow" w:hAnsi="Arial Narrow" w:cs="Arial Narrow"/>
+          <w:sz w:val="24"/>
+          <w:szCs w:val="24"/>
+        </w:rPr>
+        <w:t>Khairani</w:t>
+      </w:r>
+      <w:proofErr w:type="spellEnd"/>
+      <w:r>
+        <w:rPr>
+          <w:rFonts w:ascii="Arial Narrow" w:eastAsia="Arial Narrow" w:hAnsi="Arial Narrow" w:cs="Arial Narrow"/>
+          <w:sz w:val="24"/>
+          <w:szCs w:val="24"/>
+        </w:rPr>
+        <w:t>, SST</w:t>
       </w:r>
     </w:p>
     <w:p>
@@ -1838,7 +1898,16 @@
           <w:sz w:val="24"/>
           <w:szCs w:val="24"/>
         </w:rPr>
-        <w:t>no_spk</w:t>
+        <w:t>no_</w:t>
+      </w:r>
+      <w:proofErr w:type="gramStart"/>
+      <w:r>
+        <w:rPr>
+          <w:rFonts w:ascii="Arial Narrow" w:eastAsia="Arial Narrow" w:hAnsi="Arial Narrow" w:cs="Arial Narrow"/>
+          <w:sz w:val="24"/>
+          <w:szCs w:val="24"/>
+        </w:rPr>
+        <w:t>spk</w:t>
       </w:r>
       <w:proofErr w:type="spellEnd"/>
       <w:r>
@@ -1867,6 +1936,7 @@
         <w:t>Tahun</w:t>
       </w:r>
       <w:proofErr w:type="spellEnd"/>
+      <w:proofErr w:type="gramEnd"/>
       <w:r>
         <w:rPr>
           <w:rFonts w:ascii="Arial Narrow" w:eastAsia="Arial Narrow" w:hAnsi="Arial Narrow" w:cs="Arial Narrow"/>
@@ -3626,6 +3696,7 @@
                 <w:szCs w:val="24"/>
               </w:rPr>
             </w:pPr>
+            <w:proofErr w:type="gramStart"/>
             <w:r>
               <w:rPr>
                 <w:rFonts w:ascii="Arial Narrow" w:eastAsia="Arial Narrow" w:hAnsi="Arial Narrow" w:cs="Arial Narrow"/>
@@ -3640,7 +3711,16 @@
                 <w:sz w:val="24"/>
                 <w:szCs w:val="24"/>
               </w:rPr>
-              <w:t>${</w:t>
+              <w:t>$</w:t>
+            </w:r>
+            <w:proofErr w:type="gramEnd"/>
+            <w:r>
+              <w:rPr>
+                <w:rFonts w:ascii="Arial Narrow" w:eastAsia="Arial Narrow" w:hAnsi="Arial Narrow" w:cs="Arial Narrow"/>
+                <w:sz w:val="24"/>
+                <w:szCs w:val="24"/>
+              </w:rPr>
+              <w:t>{</w:t>
             </w:r>
             <w:proofErr w:type="spellStart"/>
             <w:r>
@@ -3652,6 +3732,7 @@
               <w:t>nama_mitra</w:t>
             </w:r>
             <w:proofErr w:type="spellEnd"/>
+            <w:proofErr w:type="gramStart"/>
             <w:r>
               <w:rPr>
                 <w:rFonts w:ascii="Arial Narrow" w:eastAsia="Arial Narrow" w:hAnsi="Arial Narrow" w:cs="Arial Narrow"/>
@@ -3668,6 +3749,7 @@
               </w:rPr>
               <w:t xml:space="preserve"> )</w:t>
             </w:r>
+            <w:proofErr w:type="gramEnd"/>
           </w:p>
         </w:tc>
         <w:tc>
@@ -3740,14 +3822,68 @@
                 <w:szCs w:val="24"/>
               </w:rPr>
             </w:pPr>
+            <w:proofErr w:type="gramStart"/>
             <w:r>
               <w:rPr>
                 <w:rFonts w:ascii="Arial Narrow" w:eastAsia="Arial Narrow" w:hAnsi="Arial Narrow" w:cs="Arial Narrow"/>
                 <w:sz w:val="24"/>
                 <w:szCs w:val="24"/>
               </w:rPr>
-              <w:t>( Widya Khairani, SST)</w:t>
+              <w:t>( Widya</w:t>
             </w:r>
+            <w:proofErr w:type="gramEnd"/>
+            <w:r>
+              <w:rPr>
+                <w:rFonts w:ascii="Arial Narrow" w:eastAsia="Arial Narrow" w:hAnsi="Arial Narrow" w:cs="Arial Narrow"/>
+                <w:sz w:val="24"/>
+                <w:szCs w:val="24"/>
+              </w:rPr>
+              <w:t xml:space="preserve"> </w:t>
+            </w:r>
+            <w:proofErr w:type="spellStart"/>
+            <w:r>
+              <w:rPr>
+                <w:rFonts w:ascii="Arial Narrow" w:eastAsia="Arial Narrow" w:hAnsi="Arial Narrow" w:cs="Arial Narrow"/>
+                <w:sz w:val="24"/>
+                <w:szCs w:val="24"/>
+              </w:rPr>
+              <w:t>Khairani</w:t>
+            </w:r>
+            <w:proofErr w:type="spellEnd"/>
+            <w:r>
+              <w:rPr>
+                <w:rFonts w:ascii="Arial Narrow" w:eastAsia="Arial Narrow" w:hAnsi="Arial Narrow" w:cs="Arial Narrow"/>
+                <w:sz w:val="24"/>
+                <w:szCs w:val="24"/>
+              </w:rPr>
+              <w:t xml:space="preserve">, </w:t>
+            </w:r>
+            <w:proofErr w:type="gramStart"/>
+            <w:r>
+              <w:rPr>
+                <w:rFonts w:ascii="Arial Narrow" w:eastAsia="Arial Narrow" w:hAnsi="Arial Narrow" w:cs="Arial Narrow"/>
+                <w:sz w:val="24"/>
+                <w:szCs w:val="24"/>
+              </w:rPr>
+              <w:t>SST</w:t>
+            </w:r>
+            <w:r>
+              <w:rPr>
+                <w:rFonts w:ascii="Arial Narrow" w:eastAsia="Arial Narrow" w:hAnsi="Arial Narrow" w:cs="Arial Narrow"/>
+                <w:sz w:val="24"/>
+                <w:szCs w:val="24"/>
+              </w:rPr>
+              <w:t xml:space="preserve"> </w:t>
+            </w:r>
+            <w:r>
+              <w:rPr>
+                <w:rFonts w:ascii="Arial Narrow" w:eastAsia="Arial Narrow" w:hAnsi="Arial Narrow" w:cs="Arial Narrow"/>
+                <w:sz w:val="24"/>
+                <w:szCs w:val="24"/>
+              </w:rPr>
+              <w:t>)</w:t>
+            </w:r>
+            <w:proofErr w:type="gramEnd"/>
           </w:p>
         </w:tc>
       </w:tr>
@@ -4528,23 +4664,13 @@
                             <w:pPr>
                               <w:textDirection w:val="btLr"/>
                             </w:pPr>
-                            <w:proofErr w:type="spellStart"/>
                             <w:r>
                               <w:rPr>
                                 <w:rFonts w:ascii="Arial Narrow" w:eastAsia="Arial Narrow" w:hAnsi="Arial Narrow" w:cs="Arial Narrow"/>
                                 <w:color w:val="000000"/>
                                 <w:sz w:val="24"/>
                               </w:rPr>
-                              <w:t>Sinabang</w:t>
-                            </w:r>
-                            <w:proofErr w:type="spellEnd"/>
-                            <w:r>
-                              <w:rPr>
-                                <w:rFonts w:ascii="Arial Narrow" w:eastAsia="Arial Narrow" w:hAnsi="Arial Narrow" w:cs="Arial Narrow"/>
-                                <w:color w:val="000000"/>
-                                <w:sz w:val="24"/>
-                              </w:rPr>
-                              <w:t xml:space="preserve">, </w:t>
+                              <w:t xml:space="preserve">Sinabang, </w:t>
                             </w:r>
                             <w:r>
                               <w:rPr>
@@ -4552,25 +4678,7 @@
                                 <w:color w:val="000000"/>
                                 <w:sz w:val="24"/>
                               </w:rPr>
-                              <w:t>${</w:t>
-                            </w:r>
-                            <w:proofErr w:type="spellStart"/>
-                            <w:r>
-                              <w:rPr>
-                                <w:rFonts w:ascii="Arial Narrow" w:eastAsia="Arial Narrow" w:hAnsi="Arial Narrow" w:cs="Arial Narrow"/>
-                                <w:color w:val="000000"/>
-                                <w:sz w:val="24"/>
-                              </w:rPr>
-                              <w:t>tgl_bast</w:t>
-                            </w:r>
-                            <w:proofErr w:type="spellEnd"/>
-                            <w:r>
-                              <w:rPr>
-                                <w:rFonts w:ascii="Arial Narrow" w:eastAsia="Arial Narrow" w:hAnsi="Arial Narrow" w:cs="Arial Narrow"/>
-                                <w:color w:val="000000"/>
-                                <w:sz w:val="24"/>
-                              </w:rPr>
-                              <w:t>}</w:t>
+                              <w:t>${tgl_bast}</w:t>
                             </w:r>
                           </w:p>
                           <w:p>
@@ -4621,25 +4729,7 @@
                                 <w:color w:val="000000"/>
                                 <w:sz w:val="24"/>
                               </w:rPr>
-                              <w:t>${</w:t>
-                            </w:r>
-                            <w:proofErr w:type="spellStart"/>
-                            <w:r>
-                              <w:rPr>
-                                <w:rFonts w:ascii="Arial Narrow" w:eastAsia="Arial Narrow" w:hAnsi="Arial Narrow" w:cs="Arial Narrow"/>
-                                <w:color w:val="000000"/>
-                                <w:sz w:val="24"/>
-                              </w:rPr>
-                              <w:t>nama_pengaju</w:t>
-                            </w:r>
-                            <w:proofErr w:type="spellEnd"/>
-                            <w:r>
-                              <w:rPr>
-                                <w:rFonts w:ascii="Arial Narrow" w:eastAsia="Arial Narrow" w:hAnsi="Arial Narrow" w:cs="Arial Narrow"/>
-                                <w:color w:val="000000"/>
-                                <w:sz w:val="24"/>
-                              </w:rPr>
-                              <w:t>}</w:t>
+                              <w:t>${nama_pengaju}</w:t>
                             </w:r>
                           </w:p>
                           <w:p>
@@ -4660,25 +4750,7 @@
                                 <w:color w:val="000000"/>
                                 <w:sz w:val="24"/>
                               </w:rPr>
-                              <w:t>${</w:t>
-                            </w:r>
-                            <w:proofErr w:type="spellStart"/>
-                            <w:r>
-                              <w:rPr>
-                                <w:rFonts w:ascii="Arial Narrow" w:eastAsia="Arial Narrow" w:hAnsi="Arial Narrow" w:cs="Arial Narrow"/>
-                                <w:color w:val="000000"/>
-                                <w:sz w:val="24"/>
-                              </w:rPr>
-                              <w:t>nip_pengaju</w:t>
-                            </w:r>
-                            <w:proofErr w:type="spellEnd"/>
-                            <w:r>
-                              <w:rPr>
-                                <w:rFonts w:ascii="Arial Narrow" w:eastAsia="Arial Narrow" w:hAnsi="Arial Narrow" w:cs="Arial Narrow"/>
-                                <w:color w:val="000000"/>
-                                <w:sz w:val="24"/>
-                              </w:rPr>
-                              <w:t>}</w:t>
+                              <w:t>${nip_pengaju}</w:t>
                             </w:r>
                           </w:p>
                         </w:txbxContent>
@@ -4898,7 +4970,7 @@
 </file>
 
 <file path=word/numbering.xml><?xml version="1.0" encoding="utf-8"?>
-<w:numbering xmlns:wpc="http://schemas.microsoft.com/office/word/2010/wordprocessingCanvas" xmlns:cx="http://schemas.microsoft.com/office/drawing/2014/chartex" xmlns:cx1="http://schemas.microsoft.com/office/drawing/2015/9/8/chartex" xmlns:cx2="http://schemas.microsoft.com/office/drawing/2015/10/21/chartex" xmlns:cx3="http://schemas.microsoft.com/office/drawing/2016/5/9/chartex" xmlns:cx4="http://schemas.microsoft.com/office/drawing/2016/5/10/chartex" xmlns:cx5="http://schemas.microsoft.com/office/drawing/2016/5/11/chartex" xmlns:cx6="http://schemas.microsoft.com/office/drawing/2016/5/12/chartex" xmlns:cx7="http://schemas.microsoft.com/office/drawing/2016/5/13/chartex" xmlns:cx8="http://schemas.microsoft.com/office/drawing/2016/5/14/chartex" xmlns:mc="http://schemas.openxmlformats.org/markup-compatibility/2006" xmlns:aink="http://schemas.microsoft.com/office/drawing/2016/ink" xmlns:am3d="http://schemas.microsoft.com/office/drawing/2017/model3d" xmlns:o="urn:schemas-microsoft-com:office:office" xmlns:oel="http://schemas.microsoft.com/office/2019/extlst" xmlns:r="http://schemas.openxmlformats.org/officeDocument/2006/relationships" xmlns:m="http://schemas.openxmlformats.org/officeDocument/2006/math" xmlns:v="urn:schemas-microsoft-com:vml" xmlns:wp14="http://schemas.microsoft.com/office/word/2010/wordprocessingDrawing" xmlns:wp="http://schemas.openxmlformats.org/drawingml/2006/wordprocessingDrawing" xmlns:w10="urn:schemas-microsoft-com:office:word" xmlns:w="http://schemas.openxmlformats.org/wordprocessingml/2006/main" xmlns:w14="http://schemas.microsoft.com/office/word/2010/wordml" xmlns:w15="http://schemas.microsoft.com/office/word/2012/wordml" xmlns:w16cex="http://schemas.microsoft.com/office/word/2018/wordml/cex" xmlns:w16cid="http://schemas.microsoft.com/office/word/2016/wordml/cid" xmlns:w16="http://schemas.microsoft.com/office/word/2018/wordml" xmlns:w16du="http://schemas.microsoft.com/office/word/2023/wordml/word16du" xmlns:w16sdtdh="http://schemas.microsoft.com/office/word/2020/wordml/sdtdatahash" xmlns:w16sdtfl="http://schemas.microsoft.com/office/word/2024/wordml/sdtformatlock" xmlns:w16se="http://schemas.microsoft.com/office/word/2015/wordml/symex" xmlns:wpg="http://schemas.microsoft.com/office/word/2010/wordprocessingGroup" xmlns:wpi="http://schemas.microsoft.com/office/word/2010/wordprocessingInk" xmlns:wne="http://schemas.microsoft.com/office/word/2006/wordml" xmlns:wps="http://schemas.microsoft.com/office/word/2010/wordprocessingShape" mc:Ignorable="w14 w15 w16se w16cid w16 w16cex w16sdtdh w16sdtfl w16du wp14">
+<w:numbering xmlns:wpc="http://schemas.microsoft.com/office/word/2010/wordprocessingCanvas" xmlns:cx="http://schemas.microsoft.com/office/drawing/2014/chartex" xmlns:cx1="http://schemas.microsoft.com/office/drawing/2015/9/8/chartex" xmlns:cx2="http://schemas.microsoft.com/office/drawing/2015/10/21/chartex" xmlns:cx3="http://schemas.microsoft.com/office/drawing/2016/5/9/chartex" xmlns:cx4="http://schemas.microsoft.com/office/drawing/2016/5/10/chartex" xmlns:cx5="http://schemas.microsoft.com/office/drawing/2016/5/11/chartex" xmlns:cx6="http://schemas.microsoft.com/office/drawing/2016/5/12/chartex" xmlns:cx7="http://schemas.microsoft.com/office/drawing/2016/5/13/chartex" xmlns:cx8="http://schemas.microsoft.com/office/drawing/2016/5/14/chartex" xmlns:mc="http://schemas.openxmlformats.org/markup-compatibility/2006" xmlns:aink="http://schemas.microsoft.com/office/drawing/2016/ink" xmlns:am3d="http://schemas.microsoft.com/office/drawing/2017/model3d" xmlns:o="urn:schemas-microsoft-com:office:office" xmlns:oel="http://schemas.microsoft.com/office/2019/extlst" xmlns:r="http://schemas.openxmlformats.org/officeDocument/2006/relationships" xmlns:m="http://schemas.openxmlformats.org/officeDocument/2006/math" xmlns:v="urn:schemas-microsoft-com:vml" xmlns:wp14="http://schemas.microsoft.com/office/word/2010/wordprocessingDrawing" xmlns:wp="http://schemas.openxmlformats.org/drawingml/2006/wordprocessingDrawing" xmlns:w10="urn:schemas-microsoft-com:office:word" xmlns:w="http://schemas.openxmlformats.org/wordprocessingml/2006/main" xmlns:w14="http://schemas.microsoft.com/office/word/2010/wordml" xmlns:w15="http://schemas.microsoft.com/office/word/2012/wordml" xmlns:w16cei="http://schemas.microsoft.com/office/word/2026/wordml/cei" xmlns:w16cex="http://schemas.microsoft.com/office/word/2018/wordml/cex" xmlns:w16cid="http://schemas.microsoft.com/office/word/2016/wordml/cid" xmlns:w16="http://schemas.microsoft.com/office/word/2018/wordml" xmlns:w16du="http://schemas.microsoft.com/office/word/2023/wordml/word16du" xmlns:w16sdtdh="http://schemas.microsoft.com/office/word/2020/wordml/sdtdatahash" xmlns:w16sdtfl="http://schemas.microsoft.com/office/word/2024/wordml/sdtformatlock" xmlns:w16se="http://schemas.microsoft.com/office/word/2015/wordml/symex" xmlns:wpg="http://schemas.microsoft.com/office/word/2010/wordprocessingGroup" xmlns:wpi="http://schemas.microsoft.com/office/word/2010/wordprocessingInk" xmlns:wne="http://schemas.microsoft.com/office/word/2006/wordml" xmlns:wps="http://schemas.microsoft.com/office/word/2010/wordprocessingShape" mc:Ignorable="w14 w15 w16se w16cid w16 w16cex w16sdtdh w16sdtfl w16du wp14">
   <w:abstractNum w:abstractNumId="0" w15:restartNumberingAfterBreak="0">
     <w:nsid w:val="42126DE6"/>
     <w:multiLevelType w:val="multilevel"/>

</xml_diff>

<commit_message>
nama dan nip ppk ketinggalan di bast
</commit_message>
<xml_diff>
--- a/public/bast-pcl-ke-ppk.docx
+++ b/public/bast-pcl-ke-ppk.docx
@@ -256,7 +256,15 @@
           <w:szCs w:val="24"/>
         </w:rPr>
         <w:tab/>
-        <w:t>:  Widya Khairani, SST</w:t>
+        <w:t xml:space="preserve">:  </w:t>
+      </w:r>
+      <w:r>
+        <w:rPr>
+          <w:rFonts w:ascii="Arial Narrow" w:eastAsia="Arial Narrow" w:hAnsi="Arial Narrow" w:cs="Arial Narrow"/>
+          <w:sz w:val="24"/>
+          <w:szCs w:val="24"/>
+        </w:rPr>
+        <w:t>${nama_ppk}</w:t>
       </w:r>
     </w:p>
     <w:p>
@@ -306,9 +314,8 @@
           <w:rFonts w:ascii="Arial Narrow" w:eastAsia="Arial Narrow" w:hAnsi="Arial Narrow" w:cs="Arial Narrow"/>
           <w:sz w:val="24"/>
           <w:szCs w:val="24"/>
-          <w:highlight w:val="white"/>
-        </w:rPr>
-        <w:t>199507282018022001</w:t>
+        </w:rPr>
+        <w:t>${nip_ppk}</w:t>
       </w:r>
     </w:p>
     <w:p>

</xml_diff>